<commit_message>
Creator and editor forms open in a right-hand panel that persists
- Every form (openForm and data-entry dialogs) opens as a panel docked at
  the right of the workspace; the page stays usable beside it.
- Clicking outside or pressing Esc never closes a panel; only x / Close do.
- Open panels are remembered in the browser tab and reopen after a refresh
  or signing in again, with their entries (server drafts, or a tab copy for
  forms without drafts).
- After a successful save the panel stays open, locked, showing "Saved"
  until the user closes it.
- Side panels no longer close on an outside click once something is typed.
- Inline form handlers moved into named functions so they can be reopened.
- UI test for the panel behaviour; user manual 1.8 and deck updated.

Co-Authored-By: Claude Opus 5.5 <noreply@anthropic.com>
Claude-Session: https://claude.ai/code/session_01BCzcS7kB9PYn4XhtsXF9GJ
</commit_message>
<xml_diff>
--- a/docs/Usermanual.docx
+++ b/docs/Usermanual.docx
@@ -4905,20 +4905,23 @@
         <w:pStyle w:val="Compact"/>
       </w:pPr>
       <w:r>
-        <w:t xml:space="preserve">Required fields have a red</w:t>
-      </w:r>
-      <w:r>
-        <w:t xml:space="preserve"> </w:t>
-      </w:r>
-      <w:r>
-        <w:rPr>
-          <w:bCs/>
-          <w:b/>
-        </w:rPr>
-        <w:t xml:space="preserve">*</w:t>
-      </w:r>
-      <w:r>
-        <w:t xml:space="preserve">. Errors appear under the field in plain words.</w:t>
+        <w:t xml:space="preserve">Every form for creating or editing a record opens in a</w:t>
+      </w:r>
+      <w:r>
+        <w:t xml:space="preserve"> </w:t>
+      </w:r>
+      <w:r>
+        <w:rPr>
+          <w:bCs/>
+          <w:b/>
+        </w:rPr>
+        <w:t xml:space="preserve">panel on the right</w:t>
+      </w:r>
+      <w:r>
+        <w:t xml:space="preserve"> </w:t>
+      </w:r>
+      <w:r>
+        <w:t xml:space="preserve">of the workspace. You can still read and click the page on the left.</w:t>
       </w:r>
     </w:p>
     <w:p>
@@ -4930,47 +4933,65 @@
         <w:pStyle w:val="Compact"/>
       </w:pPr>
       <w:r>
-        <w:t xml:space="preserve">Drafts save as you type (</w:t>
-      </w:r>
-      <w:r>
-        <w:rPr>
-          <w:iCs/>
-          <w:i/>
-        </w:rPr>
-        <w:t xml:space="preserve">“</w:t>
-      </w:r>
-      <w:r>
-        <w:rPr>
-          <w:iCs/>
-          <w:i/>
-        </w:rPr>
-        <w:t xml:space="preserve">Draft saved HH:MM</w:t>
-      </w:r>
-      <w:r>
-        <w:rPr>
-          <w:iCs/>
-          <w:i/>
-        </w:rPr>
-        <w:t xml:space="preserve">”</w:t>
-      </w:r>
-      <w:r>
-        <w:t xml:space="preserve">).</w:t>
-      </w:r>
-      <w:r>
-        <w:t xml:space="preserve"> </w:t>
-      </w:r>
-      <w:r>
-        <w:rPr>
-          <w:bCs/>
-          <w:b/>
-        </w:rPr>
-        <w:t xml:space="preserve">Save draft</w:t>
-      </w:r>
-      <w:r>
-        <w:t xml:space="preserve"> </w:t>
-      </w:r>
-      <w:r>
-        <w:t xml:space="preserve">keeps the form for later.</w:t>
+        <w:t xml:space="preserve">The panel does</w:t>
+      </w:r>
+      <w:r>
+        <w:t xml:space="preserve"> </w:t>
+      </w:r>
+      <w:r>
+        <w:rPr>
+          <w:bCs/>
+          <w:b/>
+        </w:rPr>
+        <w:t xml:space="preserve">not</w:t>
+      </w:r>
+      <w:r>
+        <w:t xml:space="preserve"> </w:t>
+      </w:r>
+      <w:r>
+        <w:t xml:space="preserve">close when you click elsewhere or press</w:t>
+      </w:r>
+      <w:r>
+        <w:t xml:space="preserve"> </w:t>
+      </w:r>
+      <w:r>
+        <w:rPr>
+          <w:bCs/>
+          <w:b/>
+        </w:rPr>
+        <w:t xml:space="preserve">Esc</w:t>
+      </w:r>
+      <w:r>
+        <w:t xml:space="preserve">. It closes only when you click</w:t>
+      </w:r>
+      <w:r>
+        <w:t xml:space="preserve"> </w:t>
+      </w:r>
+      <w:r>
+        <w:rPr>
+          <w:bCs/>
+          <w:b/>
+        </w:rPr>
+        <w:t xml:space="preserve">×</w:t>
+      </w:r>
+      <w:r>
+        <w:t xml:space="preserve"> </w:t>
+      </w:r>
+      <w:r>
+        <w:t xml:space="preserve">or</w:t>
+      </w:r>
+      <w:r>
+        <w:t xml:space="preserve"> </w:t>
+      </w:r>
+      <w:r>
+        <w:rPr>
+          <w:bCs/>
+          <w:b/>
+        </w:rPr>
+        <w:t xml:space="preserve">Close</w:t>
+      </w:r>
+      <w:r>
+        <w:t xml:space="preserve">.</w:t>
       </w:r>
     </w:p>
     <w:p>
@@ -4982,67 +5003,20 @@
         <w:pStyle w:val="Compact"/>
       </w:pPr>
       <w:r>
-        <w:t xml:space="preserve">Click the main button (</w:t>
-      </w:r>
-      <w:r>
-        <w:rPr>
-          <w:bCs/>
-          <w:b/>
-        </w:rPr>
-        <w:t xml:space="preserve">Create</w:t>
-      </w:r>
-      <w:r>
-        <w:t xml:space="preserve">,</w:t>
-      </w:r>
-      <w:r>
-        <w:t xml:space="preserve"> </w:t>
-      </w:r>
-      <w:r>
-        <w:rPr>
-          <w:bCs/>
-          <w:b/>
-        </w:rPr>
-        <w:t xml:space="preserve">Save</w:t>
-      </w:r>
-      <w:r>
-        <w:t xml:space="preserve">,</w:t>
-      </w:r>
-      <w:r>
-        <w:t xml:space="preserve"> </w:t>
-      </w:r>
-      <w:r>
-        <w:rPr>
-          <w:bCs/>
-          <w:b/>
-        </w:rPr>
-        <w:t xml:space="preserve">Save changes</w:t>
-      </w:r>
-      <w:r>
-        <w:t xml:space="preserve">…). If something is wrong:</w:t>
-      </w:r>
-      <w:r>
-        <w:t xml:space="preserve"> </w:t>
-      </w:r>
-      <w:r>
-        <w:rPr>
-          <w:iCs/>
-          <w:i/>
-        </w:rPr>
-        <w:t xml:space="preserve">“</w:t>
-      </w:r>
-      <w:r>
-        <w:rPr>
-          <w:iCs/>
-          <w:i/>
-        </w:rPr>
-        <w:t xml:space="preserve">Please correct N field(s) highlighted below. Your entries are saved as a draft.</w:t>
-      </w:r>
-      <w:r>
-        <w:rPr>
-          <w:iCs/>
-          <w:i/>
-        </w:rPr>
-        <w:t xml:space="preserve">”</w:t>
+        <w:t xml:space="preserve">Required fields have a red</w:t>
+      </w:r>
+      <w:r>
+        <w:t xml:space="preserve"> </w:t>
+      </w:r>
+      <w:r>
+        <w:rPr>
+          <w:bCs/>
+          <w:b/>
+        </w:rPr>
+        <w:t xml:space="preserve">*</w:t>
+      </w:r>
+      <w:r>
+        <w:t xml:space="preserve">. Errors appear under the field in plain words.</w:t>
       </w:r>
     </w:p>
     <w:p>
@@ -5054,10 +5028,7 @@
         <w:pStyle w:val="Compact"/>
       </w:pPr>
       <w:r>
-        <w:t xml:space="preserve">Closing a changed form keeps the draft. Reopening it shows</w:t>
-      </w:r>
-      <w:r>
-        <w:t xml:space="preserve"> </w:t>
+        <w:t xml:space="preserve">Drafts save as you type (</w:t>
       </w:r>
       <w:r>
         <w:rPr>
@@ -5071,7 +5042,7 @@
           <w:iCs/>
           <w:i/>
         </w:rPr>
-        <w:t xml:space="preserve">Restored your unsaved entries from…</w:t>
+        <w:t xml:space="preserve">Draft saved HH:MM</w:t>
       </w:r>
       <w:r>
         <w:rPr>
@@ -5081,6 +5052,200 @@
         <w:t xml:space="preserve">”</w:t>
       </w:r>
       <w:r>
+        <w:t xml:space="preserve">).</w:t>
+      </w:r>
+      <w:r>
+        <w:t xml:space="preserve"> </w:t>
+      </w:r>
+      <w:r>
+        <w:rPr>
+          <w:bCs/>
+          <w:b/>
+        </w:rPr>
+        <w:t xml:space="preserve">Save draft</w:t>
+      </w:r>
+      <w:r>
+        <w:t xml:space="preserve"> </w:t>
+      </w:r>
+      <w:r>
+        <w:t xml:space="preserve">keeps the form for later.</w:t>
+      </w:r>
+    </w:p>
+    <w:p>
+      <w:pPr>
+        <w:numPr>
+          <w:ilvl w:val="0"/>
+          <w:numId w:val="1009"/>
+        </w:numPr>
+        <w:pStyle w:val="Compact"/>
+      </w:pPr>
+      <w:r>
+        <w:t xml:space="preserve">If you refresh the page (or sign in again after being signed out), the panels you had open come back with what you typed.</w:t>
+      </w:r>
+    </w:p>
+    <w:p>
+      <w:pPr>
+        <w:numPr>
+          <w:ilvl w:val="0"/>
+          <w:numId w:val="1009"/>
+        </w:numPr>
+        <w:pStyle w:val="Compact"/>
+      </w:pPr>
+      <w:r>
+        <w:t xml:space="preserve">Click the main button (</w:t>
+      </w:r>
+      <w:r>
+        <w:rPr>
+          <w:bCs/>
+          <w:b/>
+        </w:rPr>
+        <w:t xml:space="preserve">Create</w:t>
+      </w:r>
+      <w:r>
+        <w:t xml:space="preserve">,</w:t>
+      </w:r>
+      <w:r>
+        <w:t xml:space="preserve"> </w:t>
+      </w:r>
+      <w:r>
+        <w:rPr>
+          <w:bCs/>
+          <w:b/>
+        </w:rPr>
+        <w:t xml:space="preserve">Save</w:t>
+      </w:r>
+      <w:r>
+        <w:t xml:space="preserve">,</w:t>
+      </w:r>
+      <w:r>
+        <w:t xml:space="preserve"> </w:t>
+      </w:r>
+      <w:r>
+        <w:rPr>
+          <w:bCs/>
+          <w:b/>
+        </w:rPr>
+        <w:t xml:space="preserve">Save changes</w:t>
+      </w:r>
+      <w:r>
+        <w:t xml:space="preserve">…). If something is wrong:</w:t>
+      </w:r>
+      <w:r>
+        <w:t xml:space="preserve"> </w:t>
+      </w:r>
+      <w:r>
+        <w:rPr>
+          <w:iCs/>
+          <w:i/>
+        </w:rPr>
+        <w:t xml:space="preserve">“</w:t>
+      </w:r>
+      <w:r>
+        <w:rPr>
+          <w:iCs/>
+          <w:i/>
+        </w:rPr>
+        <w:t xml:space="preserve">Please correct N field(s) highlighted below. Your entries are saved as a draft.</w:t>
+      </w:r>
+      <w:r>
+        <w:rPr>
+          <w:iCs/>
+          <w:i/>
+        </w:rPr>
+        <w:t xml:space="preserve">”</w:t>
+      </w:r>
+    </w:p>
+    <w:p>
+      <w:pPr>
+        <w:numPr>
+          <w:ilvl w:val="0"/>
+          <w:numId w:val="1009"/>
+        </w:numPr>
+        <w:pStyle w:val="Compact"/>
+      </w:pPr>
+      <w:r>
+        <w:t xml:space="preserve">After a successful save the panel stays open, locked, with</w:t>
+      </w:r>
+      <w:r>
+        <w:t xml:space="preserve"> </w:t>
+      </w:r>
+      <w:r>
+        <w:rPr>
+          <w:iCs/>
+          <w:i/>
+        </w:rPr>
+        <w:t xml:space="preserve">“</w:t>
+      </w:r>
+      <w:r>
+        <w:rPr>
+          <w:iCs/>
+          <w:i/>
+        </w:rPr>
+        <w:t xml:space="preserve">Saved HH:MM. Close this panel when you have finished.</w:t>
+      </w:r>
+      <w:r>
+        <w:rPr>
+          <w:iCs/>
+          <w:i/>
+        </w:rPr>
+        <w:t xml:space="preserve">”</w:t>
+      </w:r>
+      <w:r>
+        <w:t xml:space="preserve"> </w:t>
+      </w:r>
+      <w:r>
+        <w:t xml:space="preserve">Check the result, then click</w:t>
+      </w:r>
+      <w:r>
+        <w:t xml:space="preserve"> </w:t>
+      </w:r>
+      <w:r>
+        <w:rPr>
+          <w:bCs/>
+          <w:b/>
+        </w:rPr>
+        <w:t xml:space="preserve">Close</w:t>
+      </w:r>
+      <w:r>
+        <w:t xml:space="preserve">.</w:t>
+      </w:r>
+    </w:p>
+    <w:p>
+      <w:pPr>
+        <w:numPr>
+          <w:ilvl w:val="0"/>
+          <w:numId w:val="1009"/>
+        </w:numPr>
+        <w:pStyle w:val="Compact"/>
+      </w:pPr>
+      <w:r>
+        <w:t xml:space="preserve">Closing a changed form before saving keeps the draft. Reopening it shows</w:t>
+      </w:r>
+      <w:r>
+        <w:t xml:space="preserve"> </w:t>
+      </w:r>
+      <w:r>
+        <w:rPr>
+          <w:iCs/>
+          <w:i/>
+        </w:rPr>
+        <w:t xml:space="preserve">“</w:t>
+      </w:r>
+      <w:r>
+        <w:rPr>
+          <w:iCs/>
+          <w:i/>
+        </w:rPr>
+        <w:t xml:space="preserve">Restored your unsaved entries from…</w:t>
+      </w:r>
+      <w:r>
+        <w:rPr>
+          <w:iCs/>
+          <w:i/>
+        </w:rPr>
+        <w:t xml:space="preserve">”</w:t>
+      </w:r>
+      <w:r>
         <w:t xml:space="preserve"> </w:t>
       </w:r>
       <w:r>
@@ -5098,6 +5263,34 @@
       </w:r>
       <w:r>
         <w:t xml:space="preserve">.</w:t>
+      </w:r>
+    </w:p>
+    <w:p>
+      <w:pPr>
+        <w:numPr>
+          <w:ilvl w:val="0"/>
+          <w:numId w:val="1009"/>
+        </w:numPr>
+        <w:pStyle w:val="Compact"/>
+      </w:pPr>
+      <w:r>
+        <w:t xml:space="preserve">A form opened from inside another (for example</w:t>
+      </w:r>
+      <w:r>
+        <w:t xml:space="preserve"> </w:t>
+      </w:r>
+      <w:r>
+        <w:rPr>
+          <w:bCs/>
+          <w:b/>
+        </w:rPr>
+        <w:t xml:space="preserve">Request evidence</w:t>
+      </w:r>
+      <w:r>
+        <w:t xml:space="preserve"> </w:t>
+      </w:r>
+      <w:r>
+        <w:t xml:space="preserve">from an issue) opens on top. Closing it shows the first one again.</w:t>
       </w:r>
     </w:p>
     <w:p>
@@ -38874,6 +39067,46 @@
           <w:b/>
         </w:rPr>
         <w:t xml:space="preserve">Create user</w:t>
+      </w:r>
+      <w:r>
+        <w:t xml:space="preserve">. The panel shows</w:t>
+      </w:r>
+      <w:r>
+        <w:t xml:space="preserve"> </w:t>
+      </w:r>
+      <w:r>
+        <w:rPr>
+          <w:iCs/>
+          <w:i/>
+        </w:rPr>
+        <w:t xml:space="preserve">“</w:t>
+      </w:r>
+      <w:r>
+        <w:rPr>
+          <w:iCs/>
+          <w:i/>
+        </w:rPr>
+        <w:t xml:space="preserve">Saved</w:t>
+      </w:r>
+      <w:r>
+        <w:rPr>
+          <w:iCs/>
+          <w:i/>
+        </w:rPr>
+        <w:t xml:space="preserve">”</w:t>
+      </w:r>
+      <w:r>
+        <w:t xml:space="preserve">; click</w:t>
+      </w:r>
+      <w:r>
+        <w:t xml:space="preserve"> </w:t>
+      </w:r>
+      <w:r>
+        <w:rPr>
+          <w:bCs/>
+          <w:b/>
+        </w:rPr>
+        <w:t xml:space="preserve">Close</w:t>
       </w:r>
       <w:r>
         <w:t xml:space="preserve">.</w:t>

</xml_diff>

<commit_message>
Login page: remove the Verify Your Account button
The self-registration form it opened, its script and styles are removed;
accounts are created by administrators. Manual updated.

Co-Authored-By: Claude Opus 5.5 <noreply@anthropic.com>
Claude-Session: https://claude.ai/code/session_01BCzcS7kB9PYn4XhtsXF9GJ
</commit_message>
<xml_diff>
--- a/docs/Usermanual.docx
+++ b/docs/Usermanual.docx
@@ -1796,133 +1796,13 @@
           <w:bCs/>
           <w:b/>
         </w:rPr>
-        <w:t xml:space="preserve">Requesting an account:</w:t>
-      </w:r>
-      <w:r>
-        <w:t xml:space="preserve"> </w:t>
-      </w:r>
-      <w:r>
-        <w:t xml:space="preserve">click</w:t>
-      </w:r>
-      <w:r>
-        <w:t xml:space="preserve"> </w:t>
-      </w:r>
-      <w:r>
-        <w:rPr>
-          <w:bCs/>
-          <w:b/>
-        </w:rPr>
-        <w:t xml:space="preserve">Verify Your Account</w:t>
-      </w:r>
-      <w:r>
-        <w:t xml:space="preserve">, fill</w:t>
-      </w:r>
-      <w:r>
-        <w:t xml:space="preserve"> </w:t>
-      </w:r>
-      <w:r>
-        <w:rPr>
-          <w:bCs/>
-          <w:b/>
-        </w:rPr>
-        <w:t xml:space="preserve">Username</w:t>
-      </w:r>
-      <w:r>
-        <w:t xml:space="preserve">,</w:t>
-      </w:r>
-      <w:r>
-        <w:t xml:space="preserve"> </w:t>
-      </w:r>
-      <w:r>
-        <w:rPr>
-          <w:bCs/>
-          <w:b/>
-        </w:rPr>
-        <w:t xml:space="preserve">Email</w:t>
-      </w:r>
-      <w:r>
-        <w:t xml:space="preserve">,</w:t>
-      </w:r>
-      <w:r>
-        <w:t xml:space="preserve"> </w:t>
-      </w:r>
-      <w:r>
-        <w:rPr>
-          <w:bCs/>
-          <w:b/>
-        </w:rPr>
-        <w:t xml:space="preserve">First Name</w:t>
-      </w:r>
-      <w:r>
-        <w:t xml:space="preserve">,</w:t>
-      </w:r>
-      <w:r>
-        <w:t xml:space="preserve"> </w:t>
-      </w:r>
-      <w:r>
-        <w:rPr>
-          <w:bCs/>
-          <w:b/>
-        </w:rPr>
-        <w:t xml:space="preserve">Last Name</w:t>
-      </w:r>
-      <w:r>
-        <w:t xml:space="preserve">,</w:t>
-      </w:r>
-      <w:r>
-        <w:t xml:space="preserve"> </w:t>
-      </w:r>
-      <w:r>
-        <w:rPr>
-          <w:bCs/>
-          <w:b/>
-        </w:rPr>
-        <w:t xml:space="preserve">Company</w:t>
-      </w:r>
-      <w:r>
-        <w:t xml:space="preserve">,</w:t>
-      </w:r>
-      <w:r>
-        <w:t xml:space="preserve"> </w:t>
-      </w:r>
-      <w:r>
-        <w:rPr>
-          <w:bCs/>
-          <w:b/>
-        </w:rPr>
-        <w:t xml:space="preserve">Password (min 8 characters)</w:t>
-      </w:r>
-      <w:r>
-        <w:t xml:space="preserve"> </w:t>
-      </w:r>
-      <w:r>
-        <w:t xml:space="preserve">and</w:t>
-      </w:r>
-      <w:r>
-        <w:t xml:space="preserve"> </w:t>
-      </w:r>
-      <w:r>
-        <w:rPr>
-          <w:bCs/>
-          <w:b/>
-        </w:rPr>
-        <w:t xml:space="preserve">Confirm password</w:t>
-      </w:r>
-      <w:r>
-        <w:t xml:space="preserve">, then click</w:t>
-      </w:r>
-      <w:r>
-        <w:t xml:space="preserve"> </w:t>
-      </w:r>
-      <w:r>
-        <w:rPr>
-          <w:bCs/>
-          <w:b/>
-        </w:rPr>
-        <w:t xml:space="preserve">Request Account</w:t>
-      </w:r>
-      <w:r>
-        <w:t xml:space="preserve">. An administrator must approve it.</w:t>
+        <w:t xml:space="preserve">Getting an account:</w:t>
+      </w:r>
+      <w:r>
+        <w:t xml:space="preserve"> </w:t>
+      </w:r>
+      <w:r>
+        <w:t xml:space="preserve">accounts are created by an administrator (17.2). Ask yours if you do not have one.</w:t>
       </w:r>
     </w:p>
     <w:bookmarkStart w:id="24" w:name="first-time-two-step-set-up"/>

</xml_diff>